<commit_message>
Add screen inventory and wireframes, closing G3
NOVA-UI-001: four views, two surfaces, every OP-n exception mapped to
where it surfaces. Wireframes are 84-column ASCII, so the code style in
reference.docx drops to 9pt to keep them from wrapping in Word.

build-docs now warns instead of silently skipping a top-level doc that
nobody added to the order list - which is how ui-design.md missed the
first build.
</commit_message>
<xml_diff>
--- a/docs/dist/README.docx
+++ b/docs/dist/README.docx
@@ -28,7 +28,7 @@
         </w:p>
       </w:sdtContent>
     </w:sdt>
-    <w:bookmarkStart w:id="30" w:name="nova-documentation"/>
+    <w:bookmarkStart w:id="31" w:name="nova-documentation"/>
     <w:p>
       <w:pPr>
         <w:pStyle w:val="Heading1"/>
@@ -51,7 +51,7 @@
         <w:t xml:space="preserve">requests. Distributable DOCX and PDF are generated from these sources.</w:t>
       </w:r>
     </w:p>
-    <w:bookmarkStart w:id="19" w:name="documents"/>
+    <w:bookmarkStart w:id="20" w:name="documents"/>
     <w:p>
       <w:pPr>
         <w:pStyle w:val="Heading2"/>
@@ -536,6 +536,9 @@
             <w:pPr>
               <w:pStyle w:val="Compact"/>
             </w:pPr>
+            <w:r>
+              <w:t xml:space="preserve">NOVA-UI-001</w:t>
+            </w:r>
           </w:p>
         </w:tc>
         <w:tc>
@@ -545,6 +548,54 @@
               <w:pStyle w:val="Compact"/>
             </w:pPr>
             <w:hyperlink r:id="rId17">
+              <w:r>
+                <w:rPr>
+                  <w:rStyle w:val="Hyperlink"/>
+                </w:rPr>
+                <w:t xml:space="preserve">User Interface Design</w:t>
+              </w:r>
+            </w:hyperlink>
+          </w:p>
+        </w:tc>
+        <w:tc>
+          <w:tcPr/>
+          <w:p>
+            <w:pPr>
+              <w:pStyle w:val="Compact"/>
+            </w:pPr>
+            <w:r>
+              <w:t xml:space="preserve">Project convention. Screen inventory and wireframes</w:t>
+            </w:r>
+          </w:p>
+        </w:tc>
+        <w:tc>
+          <w:tcPr/>
+          <w:p>
+            <w:pPr>
+              <w:pStyle w:val="Compact"/>
+            </w:pPr>
+            <w:r>
+              <w:t xml:space="preserve">Draft</w:t>
+            </w:r>
+          </w:p>
+        </w:tc>
+      </w:tr>
+      <w:tr>
+        <w:tc>
+          <w:tcPr/>
+          <w:p>
+            <w:pPr>
+              <w:pStyle w:val="Compact"/>
+            </w:pPr>
+          </w:p>
+        </w:tc>
+        <w:tc>
+          <w:tcPr/>
+          <w:p>
+            <w:pPr>
+              <w:pStyle w:val="Compact"/>
+            </w:pPr>
+            <w:hyperlink r:id="rId18">
               <w:r>
                 <w:rPr>
                   <w:rStyle w:val="Hyperlink"/>
@@ -592,7 +643,7 @@
             <w:pPr>
               <w:pStyle w:val="Compact"/>
             </w:pPr>
-            <w:hyperlink r:id="rId18">
+            <w:hyperlink r:id="rId19">
               <w:r>
                 <w:rPr>
                   <w:rStyle w:val="Hyperlink"/>
@@ -626,8 +677,8 @@
         </w:tc>
       </w:tr>
     </w:tbl>
-    <w:bookmarkEnd w:id="19"/>
-    <w:bookmarkStart w:id="22" w:name="reading-order"/>
+    <w:bookmarkEnd w:id="20"/>
+    <w:bookmarkStart w:id="23" w:name="reading-order"/>
     <w:p>
       <w:pPr>
         <w:pStyle w:val="Heading2"/>
@@ -660,7 +711,7 @@
       <w:r>
         <w:t xml:space="preserve"> </w:t>
       </w:r>
-      <w:hyperlink r:id="rId20">
+      <w:hyperlink r:id="rId21">
         <w:r>
           <w:rPr>
             <w:rStyle w:val="Hyperlink"/>
@@ -674,7 +725,7 @@
       <w:r>
         <w:t xml:space="preserve"> </w:t>
       </w:r>
-      <w:hyperlink r:id="rId21">
+      <w:hyperlink r:id="rId22">
         <w:r>
           <w:rPr>
             <w:rStyle w:val="Hyperlink"/>
@@ -730,7 +781,7 @@
       <w:r>
         <w:t xml:space="preserve"> </w:t>
       </w:r>
-      <w:hyperlink r:id="rId17">
+      <w:hyperlink r:id="rId18">
         <w:r>
           <w:rPr>
             <w:rStyle w:val="Hyperlink"/>
@@ -742,8 +793,33 @@
         <w:t xml:space="preserve">.</w:t>
       </w:r>
     </w:p>
-    <w:bookmarkEnd w:id="22"/>
-    <w:bookmarkStart w:id="23" w:name="document-control"/>
+    <w:p>
+      <w:pPr>
+        <w:pStyle w:val="BodyText"/>
+      </w:pPr>
+      <w:r>
+        <w:t xml:space="preserve">Evaluating what it looks like to use:</w:t>
+      </w:r>
+      <w:r>
+        <w:t xml:space="preserve"> </w:t>
+      </w:r>
+      <w:hyperlink r:id="rId17">
+        <w:r>
+          <w:rPr>
+            <w:rStyle w:val="Hyperlink"/>
+          </w:rPr>
+          <w:t xml:space="preserve">User Interface Design</w:t>
+        </w:r>
+      </w:hyperlink>
+      <w:r>
+        <w:t xml:space="preserve"> </w:t>
+      </w:r>
+      <w:r>
+        <w:t xml:space="preserve">sections 4 and 7.</w:t>
+      </w:r>
+    </w:p>
+    <w:bookmarkEnd w:id="23"/>
+    <w:bookmarkStart w:id="24" w:name="document-control"/>
     <w:p>
       <w:pPr>
         <w:pStyle w:val="Heading2"/>
@@ -967,8 +1043,8 @@
         <w:t xml:space="preserve">. Minor for edits within a status, major on approval.</w:t>
       </w:r>
     </w:p>
-    <w:bookmarkEnd w:id="23"/>
-    <w:bookmarkStart w:id="26" w:name="building-docx-and-pdf"/>
+    <w:bookmarkEnd w:id="24"/>
+    <w:bookmarkStart w:id="27" w:name="building-docx-and-pdf"/>
     <w:p>
       <w:pPr>
         <w:pStyle w:val="Heading2"/>
@@ -987,7 +1063,7 @@
       <w:r>
         <w:t xml:space="preserve"> </w:t>
       </w:r>
-      <w:hyperlink r:id="rId24">
+      <w:hyperlink r:id="rId25">
         <w:r>
           <w:rPr>
             <w:rStyle w:val="Hyperlink"/>
@@ -1004,7 +1080,7 @@
       <w:r>
         <w:t xml:space="preserve"> </w:t>
       </w:r>
-      <w:hyperlink r:id="rId25">
+      <w:hyperlink r:id="rId26">
         <w:r>
           <w:rPr>
             <w:rStyle w:val="VerbatimChar"/>
@@ -1092,8 +1168,8 @@
         <w:t xml:space="preserve">to skip PDF.</w:t>
       </w:r>
     </w:p>
-    <w:bookmarkEnd w:id="26"/>
-    <w:bookmarkStart w:id="29" w:name="conventions"/>
+    <w:bookmarkEnd w:id="27"/>
+    <w:bookmarkStart w:id="30" w:name="conventions"/>
     <w:p>
       <w:pPr>
         <w:pStyle w:val="Heading2"/>
@@ -1116,7 +1192,7 @@
       <w:r>
         <w:t xml:space="preserve"> </w:t>
       </w:r>
-      <w:hyperlink r:id="rId27">
+      <w:hyperlink r:id="rId28">
         <w:r>
           <w:rPr>
             <w:rStyle w:val="Hyperlink"/>
@@ -1223,7 +1299,7 @@
       <w:r>
         <w:t xml:space="preserve"> </w:t>
       </w:r>
-      <w:hyperlink r:id="rId28">
+      <w:hyperlink r:id="rId29">
         <w:r>
           <w:rPr>
             <w:rStyle w:val="Hyperlink"/>
@@ -1274,8 +1350,8 @@
         <w:t xml:space="preserve">placeholders and are removed rather than softened if they cannot be filled</w:t>
       </w:r>
     </w:p>
-    <w:bookmarkEnd w:id="29"/>
     <w:bookmarkEnd w:id="30"/>
+    <w:bookmarkEnd w:id="31"/>
     <w:sectPr>
       <w:footnotePr>
         <w:numRestart w:val="eachSect"/>
@@ -2124,7 +2200,7 @@
     <w:basedOn w:val="BodyTextChar"/>
     <w:rPr>
       <w:rFonts w:ascii="Consolas" w:hAnsi="Consolas"/>
-      <w:sz w:val="22"/>
+      <w:sz w:val="18"/>
     </w:rPr>
   </w:style>
   <w:style w:customStyle="1" w:styleId="SectionNumber" w:type="character">

</xml_diff>